<commit_message>
HW7: redact a real JWT access token committed as evidence text
GitHub's secret scanning correctly flagged a live JWT returned by a real
/auth/login call in Part 1's captured evidence (raw/part1_jwt_rbac.txt,
RUN_LOG.txt, and the screenshot HTML it was rendered from). The signing
secret itself is a hardcoded dev-only placeholder already committed in
plaintext (jwt_auth.py's JWT_SECRET), so the token carried no exploitable
value, but there's no reason to keep the literal token string either --
the evidence value is "a JWT was returned", not its exact bytes. Replaced
with a placeholder, rebuilt RUN_LOG.txt, the login screenshot, and the
Word/PDF report from the redacted source.

Co-Authored-By: Claude Sonnet 5 <noreply@anthropic.com>
</commit_message>
<xml_diff>
--- a/reports/hw07/Achutuni_HW7.docx
+++ b/reports/hw07/Achutuni_HW7.docx
@@ -311,7 +311,7 @@
       <w:r>
         <w:drawing>
           <wp:inline xmlns:a="http://schemas.openxmlformats.org/drawingml/2006/main" xmlns:pic="http://schemas.openxmlformats.org/drawingml/2006/picture">
-            <wp:extent cx="5760720" cy="1355464"/>
+            <wp:extent cx="5760720" cy="1236860"/>
             <wp:docPr id="1" name="Picture 1"/>
             <wp:cNvGraphicFramePr>
               <a:graphicFrameLocks noChangeAspect="1"/>
@@ -332,7 +332,7 @@
                   <pic:spPr>
                     <a:xfrm>
                       <a:off x="0" y="0"/>
-                      <a:ext cx="5760720" cy="1355464"/>
+                      <a:ext cx="5760720" cy="1236860"/>
                     </a:xfrm>
                     <a:prstGeom prst="rect"/>
                   </pic:spPr>

</xml_diff>